<commit_message>
docs: discussao critica, conclusao e capa do relatorio
- secao 6 (papel do medico, limites dos dados, validacao e incerteza, erros
  do modelo com analise dos 6 falsos negativos, escore nao calibrado,
  dependencia da glicose, equidade) e secao 7 (conclusao)
- capa com nome e RM
</commit_message>
<xml_diff>
--- a/reports/relatorio-tecnico.docx
+++ b/reports/relatorio-tecnico.docx
@@ -49,7 +49,6 @@
     </w:p>
     <w:p>
       <w:pPr>
-        <w:shd w:fill="FFF2B3" w:val="clear"/>
         <w:spacing w:after="80"/>
         <w:jc w:val="center"/>
       </w:pPr>
@@ -61,7 +60,7 @@
           <w:sz w:val="22"/>
           <w:szCs w:val="22"/>
         </w:rPr>
-        <w:t xml:space="preserve">[Nome do autor] · [RM] · [Data de entrega: 03/11/2026]</w:t>
+        <w:t xml:space="preserve">Pedro Henrique Cassemiro da Silva · RM 378274 · Novembro de 2026</w:t>
       </w:r>
     </w:p>
     <w:p>
@@ -6229,207 +6228,240 @@
     </w:p>
     <w:p>
       <w:pPr>
-        <w:shd w:fill="FFF2B3" w:val="clear"/>
-        <w:spacing w:after="100" w:line="300"/>
-      </w:pPr>
-      <w:r>
-        <w:rPr>
-          <w:rFonts w:ascii="Arial" w:cs="Arial" w:eastAsia="Arial" w:hAnsi="Arial"/>
-          <w:i/>
-          <w:iCs/>
-          <w:sz w:val="21"/>
-          <w:szCs w:val="21"/>
-        </w:rPr>
-        <w:t xml:space="preserve">[ESCREVER] Seção para o autor escrever com as próprias palavras. Os tópicos abaixo são um guia, com os fatos do projeto que cada um deve considerar. Apague esta nota e os tópicos ao terminar.</w:t>
-      </w:r>
-    </w:p>
-    <w:p>
-      <w:pPr>
-        <w:pStyle w:val="ListParagraph"/>
-        <w:numPr>
-          <w:ilvl w:val="0"/>
-          <w:numId w:val="2"/>
-        </w:numPr>
-        <w:shd w:fill="FFF2B3" w:val="clear"/>
-        <w:spacing w:after="60" w:line="290"/>
-      </w:pPr>
-      <w:r>
-        <w:rPr>
-          <w:rFonts w:ascii="Arial" w:cs="Arial" w:eastAsia="Arial" w:hAnsi="Arial"/>
-          <w:i/>
-          <w:iCs/>
-          <w:sz w:val="21"/>
-          <w:szCs w:val="21"/>
-        </w:rPr>
-        <w:t xml:space="preserve">Papel do médico: o modelo apoia a triagem e não diagnostica. Como o escore deve ser apresentado e usado, e por que a decisão final é do médico.</w:t>
-      </w:r>
-    </w:p>
-    <w:p>
-      <w:pPr>
-        <w:pStyle w:val="ListParagraph"/>
-        <w:numPr>
-          <w:ilvl w:val="0"/>
-          <w:numId w:val="2"/>
-        </w:numPr>
-        <w:shd w:fill="FFF2B3" w:val="clear"/>
-        <w:spacing w:after="60" w:line="290"/>
-      </w:pPr>
-      <w:r>
-        <w:rPr>
-          <w:rFonts w:ascii="Arial" w:cs="Arial" w:eastAsia="Arial" w:hAnsi="Arial"/>
-          <w:i/>
-          <w:iCs/>
-          <w:sz w:val="21"/>
-          <w:szCs w:val="21"/>
-        </w:rPr>
-        <w:t xml:space="preserve">População restrita: apenas mulheres de origem Pima com 21 anos ou mais. O que isso limita sobre generalizar para outras populações.</w:t>
-      </w:r>
-    </w:p>
-    <w:p>
-      <w:pPr>
-        <w:pStyle w:val="ListParagraph"/>
-        <w:numPr>
-          <w:ilvl w:val="0"/>
-          <w:numId w:val="2"/>
-        </w:numPr>
-        <w:shd w:fill="FFF2B3" w:val="clear"/>
-        <w:spacing w:after="60" w:line="290"/>
-      </w:pPr>
-      <w:r>
-        <w:rPr>
-          <w:rFonts w:ascii="Arial" w:cs="Arial" w:eastAsia="Arial" w:hAnsi="Arial"/>
-          <w:i/>
-          <w:iCs/>
-          <w:sz w:val="21"/>
-          <w:szCs w:val="21"/>
-        </w:rPr>
-        <w:t xml:space="preserve">Sem validação externa: todos os resultados vêm de uma única base dividida em treino, validação e teste. O que seria necessário antes de qualquer uso real.</w:t>
-      </w:r>
-    </w:p>
-    <w:p>
-      <w:pPr>
-        <w:pStyle w:val="ListParagraph"/>
-        <w:numPr>
-          <w:ilvl w:val="0"/>
-          <w:numId w:val="2"/>
-        </w:numPr>
-        <w:shd w:fill="FFF2B3" w:val="clear"/>
-        <w:spacing w:after="60" w:line="290"/>
-      </w:pPr>
-      <w:r>
-        <w:rPr>
-          <w:rFonts w:ascii="Arial" w:cs="Arial" w:eastAsia="Arial" w:hAnsi="Arial"/>
-          <w:i/>
-          <w:iCs/>
-          <w:sz w:val="21"/>
-          <w:szCs w:val="21"/>
-        </w:rPr>
-        <w:t xml:space="preserve">Incerteza do teste: 41 positivas, recall de 0,854 com IC 95% de 0,716 a 0,931. O que o limite inferior significa na prática.</w:t>
-      </w:r>
-    </w:p>
-    <w:p>
-      <w:pPr>
-        <w:pStyle w:val="ListParagraph"/>
-        <w:numPr>
-          <w:ilvl w:val="0"/>
-          <w:numId w:val="2"/>
-        </w:numPr>
-        <w:shd w:fill="FFF2B3" w:val="clear"/>
-        <w:spacing w:after="60" w:line="290"/>
-      </w:pPr>
-      <w:r>
-        <w:rPr>
-          <w:rFonts w:ascii="Arial" w:cs="Arial" w:eastAsia="Arial" w:hAnsi="Arial"/>
-          <w:i/>
-          <w:iCs/>
-          <w:sz w:val="21"/>
-          <w:szCs w:val="21"/>
-        </w:rPr>
-        <w:t xml:space="preserve">Os 6 falsos negativos: o que significa deixar de sinalizar essas pacientes, e como o limiar (0,34) troca falsos negativos por falsos positivos (20 no teste).</w:t>
-      </w:r>
-    </w:p>
-    <w:p>
-      <w:pPr>
-        <w:pStyle w:val="ListParagraph"/>
-        <w:numPr>
-          <w:ilvl w:val="0"/>
-          <w:numId w:val="2"/>
-        </w:numPr>
-        <w:shd w:fill="FFF2B3" w:val="clear"/>
-        <w:spacing w:after="60" w:line="290"/>
-      </w:pPr>
-      <w:r>
-        <w:rPr>
-          <w:rFonts w:ascii="Arial" w:cs="Arial" w:eastAsia="Arial" w:hAnsi="Arial"/>
-          <w:i/>
-          <w:iCs/>
-          <w:sz w:val="21"/>
-          <w:szCs w:val="21"/>
-        </w:rPr>
-        <w:t xml:space="preserve">Escore não calibrado: o balanceamento de classes desloca os valores, então o escore não deve ser lido como probabilidade.</w:t>
-      </w:r>
-    </w:p>
-    <w:p>
-      <w:pPr>
-        <w:pStyle w:val="ListParagraph"/>
-        <w:numPr>
-          <w:ilvl w:val="0"/>
-          <w:numId w:val="2"/>
-        </w:numPr>
-        <w:shd w:fill="FFF2B3" w:val="clear"/>
-        <w:spacing w:after="60" w:line="290"/>
-      </w:pPr>
-      <w:r>
-        <w:rPr>
-          <w:rFonts w:ascii="Arial" w:cs="Arial" w:eastAsia="Arial" w:hAnsi="Arial"/>
-          <w:i/>
-          <w:iCs/>
-          <w:sz w:val="21"/>
-          <w:szCs w:val="21"/>
-        </w:rPr>
-        <w:t xml:space="preserve">Dependência da glicose: é a variável dominante. Como erros ou ausência dessa medida afetam o resultado.</w:t>
-      </w:r>
-    </w:p>
-    <w:p>
-      <w:pPr>
-        <w:pStyle w:val="ListParagraph"/>
-        <w:numPr>
-          <w:ilvl w:val="0"/>
-          <w:numId w:val="2"/>
-        </w:numPr>
-        <w:shd w:fill="FFF2B3" w:val="clear"/>
-        <w:spacing w:after="60" w:line="290"/>
-      </w:pPr>
-      <w:r>
-        <w:rPr>
-          <w:rFonts w:ascii="Arial" w:cs="Arial" w:eastAsia="Arial" w:hAnsi="Arial"/>
-          <w:i/>
-          <w:iCs/>
-          <w:sz w:val="21"/>
-          <w:szCs w:val="21"/>
-        </w:rPr>
-        <w:t xml:space="preserve">Dados ausentes: até 49% da insulina estava ausente e foi imputada pela mediana. Efeito possível sobre as previsões.</w:t>
-      </w:r>
-    </w:p>
-    <w:p>
-      <w:pPr>
-        <w:pStyle w:val="ListParagraph"/>
-        <w:numPr>
-          <w:ilvl w:val="0"/>
-          <w:numId w:val="2"/>
-        </w:numPr>
-        <w:shd w:fill="FFF2B3" w:val="clear"/>
-        <w:spacing w:after="60" w:line="290"/>
-      </w:pPr>
-      <w:r>
-        <w:rPr>
-          <w:rFonts w:ascii="Arial" w:cs="Arial" w:eastAsia="Arial" w:hAnsi="Arial"/>
-          <w:i/>
-          <w:iCs/>
-          <w:sz w:val="21"/>
-          <w:szCs w:val="21"/>
-        </w:rPr>
-        <w:t xml:space="preserve">Dados antigos e possíveis vieses de coleta: o dataset é de 1988.</w:t>
+        <w:pStyle w:val="Heading2"/>
+        <w:spacing w:after="120" w:before="240"/>
+      </w:pPr>
+      <w:r>
+        <w:rPr>
+          <w:rFonts w:ascii="Arial" w:cs="Arial" w:eastAsia="Arial" w:hAnsi="Arial"/>
+          <w:b/>
+          <w:bCs/>
+          <w:sz w:val="25"/>
+          <w:szCs w:val="25"/>
+        </w:rPr>
+        <w:t xml:space="preserve">6.1 Papel do modelo e do médico</w:t>
+      </w:r>
+    </w:p>
+    <w:p>
+      <w:pPr>
+        <w:spacing w:after="140" w:line="300"/>
+        <w:jc w:val="both"/>
+      </w:pPr>
+      <w:r>
+        <w:rPr>
+          <w:rFonts w:ascii="Arial" w:cs="Arial" w:eastAsia="Arial" w:hAnsi="Arial"/>
+          <w:sz w:val="22"/>
+          <w:szCs w:val="22"/>
+        </w:rPr>
+        <w:t xml:space="preserve">O modelo não faz diagnóstico: ele produz um escore de risco que serve para priorizar quem deve fazer um exame confirmatório. Ser sinalizada significa "vale confirmar", e não ser sinalizada não significa "não tem a doença", já que 6 das 41 pacientes com diabetes do teste não foram sinalizadas. A decisão final cabe ao médico, que tem informações que o modelo não vê (sintomas, histórico clínico, outros exames) e pode discordar do escore. Para apoiar essa leitura, a API devolve a contribuição de cada variável e marca quais valores estavam ausentes e foram preenchidos, de modo que o médico possa conferir o que pesou no resultado e desconfiar dele quando as entradas forem frágeis.</w:t>
+      </w:r>
+    </w:p>
+    <w:p>
+      <w:pPr>
+        <w:pStyle w:val="Heading2"/>
+        <w:spacing w:after="120" w:before="240"/>
+      </w:pPr>
+      <w:r>
+        <w:rPr>
+          <w:rFonts w:ascii="Arial" w:cs="Arial" w:eastAsia="Arial" w:hAnsi="Arial"/>
+          <w:b/>
+          <w:bCs/>
+          <w:sz w:val="25"/>
+          <w:szCs w:val="25"/>
+        </w:rPr>
+        <w:t xml:space="preserve">6.2 Limites dos dados</w:t>
+      </w:r>
+    </w:p>
+    <w:p>
+      <w:pPr>
+        <w:spacing w:after="140" w:line="300"/>
+        <w:jc w:val="both"/>
+      </w:pPr>
+      <w:r>
+        <w:rPr>
+          <w:rFonts w:ascii="Arial" w:cs="Arial" w:eastAsia="Arial" w:hAnsi="Arial"/>
+          <w:sz w:val="22"/>
+          <w:szCs w:val="22"/>
+        </w:rPr>
+        <w:t xml:space="preserve">O dataset reúne apenas mulheres de origem Pima com 21 anos ou mais, coletadas há décadas (Smith et al., 1988). O modelo não foi testado em homens, em outras origens étnicas, em outras faixas etárias ou com protocolos de medição atuais, e não há motivo para supor que os mesmos coeficientes valham nesses grupos. A prevalência também importa: 35% das pacientes têm diabetes, bem mais do que numa população geral. Com a mesma sensibilidade e a mesma especificidade, uma prevalência menor faz a precisão cair, ou seja, haveria mais falsos positivos para cada paciente corretamente sinalizada do que mostram os números deste trabalho.</w:t>
+      </w:r>
+    </w:p>
+    <w:p>
+      <w:pPr>
+        <w:spacing w:after="140" w:line="300"/>
+        <w:jc w:val="both"/>
+      </w:pPr>
+      <w:r>
+        <w:rPr>
+          <w:rFonts w:ascii="Arial" w:cs="Arial" w:eastAsia="Arial" w:hAnsi="Arial"/>
+          <w:sz w:val="22"/>
+          <w:szCs w:val="22"/>
+        </w:rPr>
+        <w:t xml:space="preserve">Há ainda o problema dos valores ausentes: 49% da insulina e 30% da dobra cutânea estavam registradas como zero. A imputação pela mediana é simples e supõe que essas pacientes se pareçam com a paciente típica, o que não foi verificado. Outras técnicas de imputação não foram exploradas. O teste do indicador de ausência não mostrou ganho, mas isso não garante que os ausentes sejam aleatórios.</w:t>
+      </w:r>
+    </w:p>
+    <w:p>
+      <w:pPr>
+        <w:pStyle w:val="Heading2"/>
+        <w:spacing w:after="120" w:before="240"/>
+      </w:pPr>
+      <w:r>
+        <w:rPr>
+          <w:rFonts w:ascii="Arial" w:cs="Arial" w:eastAsia="Arial" w:hAnsi="Arial"/>
+          <w:b/>
+          <w:bCs/>
+          <w:sz w:val="25"/>
+          <w:szCs w:val="25"/>
+        </w:rPr>
+        <w:t xml:space="preserve">6.3 Validação e incerteza</w:t>
+      </w:r>
+    </w:p>
+    <w:p>
+      <w:pPr>
+        <w:spacing w:after="140" w:line="300"/>
+        <w:jc w:val="both"/>
+      </w:pPr>
+      <w:r>
+        <w:rPr>
+          <w:rFonts w:ascii="Arial" w:cs="Arial" w:eastAsia="Arial" w:hAnsi="Arial"/>
+          <w:sz w:val="22"/>
+          <w:szCs w:val="22"/>
+        </w:rPr>
+        <w:t xml:space="preserve">Todos os resultados vêm de uma única base, dividida de forma aleatória, sem validação externa. O conjunto de teste tem 116 pacientes, das quais 41 positivas, e isso torna a estimativa imprecisa: o recall de 0,854 tem intervalo de confiança de 95% de 0,716 a 0,931. O limite inferior está bem abaixo da meta de 0,85, então o resultado não permite afirmar que o modelo atinge essa meta em dados novos. Na validação o recall foi 0,925, e a diferença entre os dois conjuntos é compatível com a variação esperada de amostras pequenas. Usar o teste uma única vez evita uma estimativa otimista, mas não elimina a incerteza. Antes de qualquer uso real, seriam necessárias validação em outra população e, depois, um estudo prospectivo.</w:t>
+      </w:r>
+    </w:p>
+    <w:p>
+      <w:pPr>
+        <w:pStyle w:val="Heading2"/>
+        <w:spacing w:after="120" w:before="240"/>
+      </w:pPr>
+      <w:r>
+        <w:rPr>
+          <w:rFonts w:ascii="Arial" w:cs="Arial" w:eastAsia="Arial" w:hAnsi="Arial"/>
+          <w:b/>
+          <w:bCs/>
+          <w:sz w:val="25"/>
+          <w:szCs w:val="25"/>
+        </w:rPr>
+        <w:t xml:space="preserve">6.4 Os erros do modelo</w:t>
+      </w:r>
+    </w:p>
+    <w:p>
+      <w:pPr>
+        <w:spacing w:after="140" w:line="300"/>
+        <w:jc w:val="both"/>
+      </w:pPr>
+      <w:r>
+        <w:rPr>
+          <w:rFonts w:ascii="Arial" w:cs="Arial" w:eastAsia="Arial" w:hAnsi="Arial"/>
+          <w:sz w:val="22"/>
+          <w:szCs w:val="22"/>
+        </w:rPr>
+        <w:t xml:space="preserve">No teste houve 6 falsos negativos e 20 falsos positivos. Olhando os 6 falsos negativos, todos têm glicose entre 90 e 129 mg/dL (mediana de 107,5, contra 145,5 nas pacientes com diabetes que foram sinalizadas) e escores entre 0,21 e 0,28, todos abaixo do limiar de 0,34. Como o modelo depende muito da glicose, as pacientes com diabetes e glicose baixa ou intermediária tendem a passar sem ser sinalizadas, e as demais variáveis (IMC, idade, gestações) não compensaram nesses casos. Em 4 dos 6 casos a insulina estava ausente, mas são poucos casos para tirar conclusões.</w:t>
+      </w:r>
+    </w:p>
+    <w:p>
+      <w:pPr>
+        <w:spacing w:after="140" w:line="300"/>
+        <w:jc w:val="both"/>
+      </w:pPr>
+      <w:r>
+        <w:rPr>
+          <w:rFonts w:ascii="Arial" w:cs="Arial" w:eastAsia="Arial" w:hAnsi="Arial"/>
+          <w:sz w:val="22"/>
+          <w:szCs w:val="22"/>
+        </w:rPr>
+        <w:t xml:space="preserve">Os falsos positivos têm um custo menor, um exame a mais, mas não nulo: há ansiedade da paciente e uso de recursos do serviço de saúde. O limiar de 0,34 é uma escolha de valor: ele troca falsos negativos por falsos positivos, como mostra a Tabela 4, e a meta de recall de 0,85 foi definida neste trabalho sem consultar quem arcaria com esses custos. Num uso real, esse ponto de corte deveria ser decidido com a equipe clínica, e não apenas pela modelagem.</w:t>
+      </w:r>
+    </w:p>
+    <w:p>
+      <w:pPr>
+        <w:pStyle w:val="Heading2"/>
+        <w:spacing w:after="120" w:before="240"/>
+      </w:pPr>
+      <w:r>
+        <w:rPr>
+          <w:rFonts w:ascii="Arial" w:cs="Arial" w:eastAsia="Arial" w:hAnsi="Arial"/>
+          <w:b/>
+          <w:bCs/>
+          <w:sz w:val="25"/>
+          <w:szCs w:val="25"/>
+        </w:rPr>
+        <w:t xml:space="preserve">6.5 O escore não é uma probabilidade</w:t>
+      </w:r>
+    </w:p>
+    <w:p>
+      <w:pPr>
+        <w:spacing w:after="140" w:line="300"/>
+        <w:jc w:val="both"/>
+      </w:pPr>
+      <w:r>
+        <w:rPr>
+          <w:rFonts w:ascii="Arial" w:cs="Arial" w:eastAsia="Arial" w:hAnsi="Arial"/>
+          <w:sz w:val="22"/>
+          <w:szCs w:val="22"/>
+        </w:rPr>
+        <w:t xml:space="preserve">O balanceamento de classes desloca as saídas do modelo, então um escore de 0,72 não significa 72% de chance de ter diabetes. O escore serve para ordenar as pacientes e compará-las com o limiar. Para interpretá-lo como probabilidade seria preciso calibrar o modelo com dados separados (por exemplo, calibração isotônica ou de Platt), o que não foi feito. A API avisa isso na resposta.</w:t>
+      </w:r>
+    </w:p>
+    <w:p>
+      <w:pPr>
+        <w:pStyle w:val="Heading2"/>
+        <w:spacing w:after="120" w:before="240"/>
+      </w:pPr>
+      <w:r>
+        <w:rPr>
+          <w:rFonts w:ascii="Arial" w:cs="Arial" w:eastAsia="Arial" w:hAnsi="Arial"/>
+          <w:b/>
+          <w:bCs/>
+          <w:sz w:val="25"/>
+          <w:szCs w:val="25"/>
+        </w:rPr>
+        <w:t xml:space="preserve">6.6 Dependência da glicose</w:t>
+      </w:r>
+    </w:p>
+    <w:p>
+      <w:pPr>
+        <w:spacing w:after="140" w:line="300"/>
+        <w:jc w:val="both"/>
+      </w:pPr>
+      <w:r>
+        <w:rPr>
+          <w:rFonts w:ascii="Arial" w:cs="Arial" w:eastAsia="Arial" w:hAnsi="Arial"/>
+          <w:sz w:val="22"/>
+          <w:szCs w:val="22"/>
+        </w:rPr>
+        <w:t xml:space="preserve">A glicose é a variável dominante, tanto nos coeficientes (odds ratio de 3,10) quanto no SHAP. Isso é coerente com a clínica, já que a glicose é um dos critérios usados para diagnosticar diabetes, mas traz dois cuidados. O primeiro é que, segundo a documentação original do dataset, o rótulo foi definido por critérios da OMS que incluem a glicose após sobrecarga; se for assim, parte do peso da glicose reflete a própria definição do rótulo, e o modelo se parece mais com a reprodução de um critério do que com a previsão de um diagnóstico futuro (esse ponto precisa ser conferido na fonte). O segundo é prático: a glicose é obrigatória na API, e uma medida errada ou mal coletada afeta muito o resultado.</w:t>
+      </w:r>
+    </w:p>
+    <w:p>
+      <w:pPr>
+        <w:pStyle w:val="Heading2"/>
+        <w:spacing w:after="120" w:before="240"/>
+      </w:pPr>
+      <w:r>
+        <w:rPr>
+          <w:rFonts w:ascii="Arial" w:cs="Arial" w:eastAsia="Arial" w:hAnsi="Arial"/>
+          <w:b/>
+          <w:bCs/>
+          <w:sz w:val="25"/>
+          <w:szCs w:val="25"/>
+        </w:rPr>
+        <w:t xml:space="preserve">6.7 Equidade e uso responsável</w:t>
+      </w:r>
+    </w:p>
+    <w:p>
+      <w:pPr>
+        <w:spacing w:after="140" w:line="300"/>
+        <w:jc w:val="both"/>
+      </w:pPr>
+      <w:r>
+        <w:rPr>
+          <w:rFonts w:ascii="Arial" w:cs="Arial" w:eastAsia="Arial" w:hAnsi="Arial"/>
+          <w:sz w:val="22"/>
+          <w:szCs w:val="22"/>
+        </w:rPr>
+        <w:t xml:space="preserve">Um modelo treinado numa população específica pode funcionar pior em grupos sub-representados e, se aplicado sem cuidado, reforçar desigualdades no acesso a exames. Há ainda o risco de excesso de confiança no resultado: um escore preciso na aparência pode levar a decisões automáticas, o que é justamente o que o desenho do projeto tenta evitar. Dados de saúde exigem proteção de privacidade, que ficaria a cargo de quem colocasse a API em operação.</w:t>
       </w:r>
     </w:p>
     <w:p>
@@ -6450,18 +6482,44 @@
     </w:p>
     <w:p>
       <w:pPr>
-        <w:shd w:fill="FFF2B3" w:val="clear"/>
-        <w:spacing w:after="100" w:line="300"/>
-      </w:pPr>
-      <w:r>
-        <w:rPr>
-          <w:rFonts w:ascii="Arial" w:cs="Arial" w:eastAsia="Arial" w:hAnsi="Arial"/>
-          <w:i/>
-          <w:iCs/>
-          <w:sz w:val="21"/>
-          <w:szCs w:val="21"/>
-        </w:rPr>
-        <w:t xml:space="preserve">[ESCREVER] Fechamento do relatório: o que foi feito, o resultado principal, as limitações mais importantes e os próximos passos (por exemplo, validação externa e calibração do escore).</w:t>
+        <w:spacing w:after="140" w:line="300"/>
+        <w:jc w:val="both"/>
+      </w:pPr>
+      <w:r>
+        <w:rPr>
+          <w:rFonts w:ascii="Arial" w:cs="Arial" w:eastAsia="Arial" w:hAnsi="Arial"/>
+          <w:sz w:val="22"/>
+          <w:szCs w:val="22"/>
+        </w:rPr>
+        <w:t xml:space="preserve">Este trabalho construiu um modelo de apoio à triagem de diabetes sobre o dataset Pima, com pré-processamento em pipeline, divisão em treino, validação e teste, comparação de modelos por validação cruzada e interpretação por coeficientes e SHAP. A escolha final foi uma regressão logística balanceada, praticamente empatada com o Random Forest, mas mais simples e mais fácil de explicar, com um limiar de 0,34 definido só com dados de treino para priorizar o recall.</w:t>
+      </w:r>
+    </w:p>
+    <w:p>
+      <w:pPr>
+        <w:spacing w:after="140" w:line="300"/>
+        <w:jc w:val="both"/>
+      </w:pPr>
+      <w:r>
+        <w:rPr>
+          <w:rFonts w:ascii="Arial" w:cs="Arial" w:eastAsia="Arial" w:hAnsi="Arial"/>
+          <w:sz w:val="22"/>
+          <w:szCs w:val="22"/>
+        </w:rPr>
+        <w:t xml:space="preserve">No teste, o modelo sinalizou 35 das 41 pacientes com diabetes (recall de 0,854, IC 95% de 0,716 a 0,931), com precisão de 0,636 e ROC-AUC de 0,861. O resultado é razoável para uma triagem inicial, mas a incerteza do teste, a restrição da população, a ausência de validação externa e a dependência da glicose impedem qualquer uso clínico sem validação adicional. O papel do modelo é o de um apoio: o médico continua com a palavra final.</w:t>
+      </w:r>
+    </w:p>
+    <w:p>
+      <w:pPr>
+        <w:spacing w:after="140" w:line="300"/>
+        <w:jc w:val="both"/>
+      </w:pPr>
+      <w:r>
+        <w:rPr>
+          <w:rFonts w:ascii="Arial" w:cs="Arial" w:eastAsia="Arial" w:hAnsi="Arial"/>
+          <w:sz w:val="22"/>
+          <w:szCs w:val="22"/>
+        </w:rPr>
+        <w:t xml:space="preserve">Como próximos passos, ficam a validação em outra população, a calibração do escore, a comparação com outras técnicas de imputação e de modelagem, e a definição do limiar de decisão em conjunto com a equipe clínica.</w:t>
       </w:r>
     </w:p>
     <w:p>

</xml_diff>